<commit_message>
Optimize schema indexes, seed realistic Moroccan demo data, and add architecture diagrams.
</commit_message>
<xml_diff>
--- a/docs/Diagramme_Cas_Utilisation_HireLink.docx
+++ b/docs/Diagramme_Cas_Utilisation_HireLink.docx
@@ -27,7 +27,7 @@
           <w:color w:val="5A5A5A"/>
           <w:sz w:val="22"/>
         </w:rPr>
-        <w:t>ENSA Tétouan · Module Frameworks Technologie Web · 2026-2027</w:t>
+        <w:t>ENSA Tétouan · Frameworks Technologie Web · 2026-2027</w:t>
       </w:r>
     </w:p>
     <w:p>
@@ -35,12 +35,22 @@
         <w:pStyle w:val="Heading1"/>
       </w:pPr>
       <w:r>
-        <w:t>1. Objectif du diagramme</w:t>
+        <w:t>1. Acteurs</w:t>
       </w:r>
     </w:p>
     <w:p>
       <w:r>
-        <w:t>Ce diagramme décrit les interactions entre les acteurs et le système HireLink (ATS bilatéral). Il respecte les conventions UML 2 : frontière système, cas d'utilisation (ovales), acteurs (stickmen), associations, et relations &lt;&lt;include&gt;&gt; lorsque le comportement est obligatoirement réutilisé.</w:t>
+        <w:t>Principaux : Candidat, Personne RH.</w:t>
+      </w:r>
+    </w:p>
+    <w:p>
+      <w:r>
+        <w:t>Secondaires : Hiring Manager, Administrateur de l'application HireLink.</w:t>
+      </w:r>
+    </w:p>
+    <w:p>
+      <w:r>
+        <w:t>Systèmes : Google, Matching, Scheduler, Messagerie, LLM, Paiement.</w:t>
       </w:r>
     </w:p>
     <w:p>
@@ -48,87 +58,7 @@
         <w:pStyle w:val="Heading1"/>
       </w:pPr>
       <w:r>
-        <w:t>2. Organisation des acteurs</w:t>
-      </w:r>
-    </w:p>
-    <w:p>
-      <w:pPr>
-        <w:pStyle w:val="ListBullet"/>
-      </w:pPr>
-      <w:r>
-        <w:t>Acteurs principaux (à gauche) — initient les cas d'utilisation :</w:t>
-      </w:r>
-    </w:p>
-    <w:p>
-      <w:pPr>
-        <w:pStyle w:val="ListBullet"/>
-      </w:pPr>
-      <w:r>
-        <w:t>Candidat — postule, suit ses dossiers, exporte ses données.</w:t>
-      </w:r>
-    </w:p>
-    <w:p>
-      <w:pPr>
-        <w:pStyle w:val="ListBullet"/>
-      </w:pPr>
-      <w:r>
-        <w:t>Personne RH (Owner / Recruteur) — publie les offres, pilote le pipeline, invite l'équipe.</w:t>
-      </w:r>
-    </w:p>
-    <w:p>
-      <w:pPr>
-        <w:pStyle w:val="ListBullet"/>
-      </w:pPr>
-      <w:r>
-        <w:t>Hiring Manager — note les scorecards et mène les entretiens sur dossiers assignés.</w:t>
-      </w:r>
-    </w:p>
-    <w:p>
-      <w:pPr>
-        <w:pStyle w:val="ListBullet"/>
-      </w:pPr>
-      <w:r>
-        <w:t>Administrateur — vérifie les entreprises (ICE) et supervise la plateforme.</w:t>
-      </w:r>
-    </w:p>
-    <w:p>
-      <w:pPr>
-        <w:pStyle w:val="ListBullet"/>
-      </w:pPr>
-      <w:r>
-        <w:t>Acteurs secondaires / systèmes (à droite) — sollicités par HireLink :</w:t>
-      </w:r>
-    </w:p>
-    <w:p>
-      <w:pPr>
-        <w:pStyle w:val="ListBullet"/>
-      </w:pPr>
-      <w:r>
-        <w:t>Module matching local (F14) — calcul déterministe des scores (aucun crédit IA).</w:t>
-      </w:r>
-    </w:p>
-    <w:p>
-      <w:pPr>
-        <w:pStyle w:val="ListBullet"/>
-      </w:pPr>
-      <w:r>
-        <w:t>Fournisseur LLM (API externe F15) — rédaction assistée ; ne décide jamais.</w:t>
-      </w:r>
-    </w:p>
-    <w:p>
-      <w:pPr>
-        <w:pStyle w:val="ListBullet"/>
-      </w:pPr>
-      <w:r>
-        <w:t>Scheduler — calcule les retards SLA et déclenche les rappels.</w:t>
-      </w:r>
-    </w:p>
-    <w:p>
-      <w:pPr>
-        <w:pStyle w:val="Heading1"/>
-      </w:pPr>
-      <w:r>
-        <w:t>3. Diagramme</w:t>
+        <w:t>2. Diagramme</w:t>
       </w:r>
     </w:p>
     <w:p>
@@ -138,7 +68,7 @@
       <w:r>
         <w:drawing>
           <wp:inline xmlns:a="http://schemas.openxmlformats.org/drawingml/2006/main" xmlns:pic="http://schemas.openxmlformats.org/drawingml/2006/picture">
-            <wp:extent cx="5940000" cy="4083750"/>
+            <wp:extent cx="5940000" cy="2568649"/>
             <wp:docPr id="1" name="Picture 1"/>
             <wp:cNvGraphicFramePr>
               <a:graphicFrameLocks noChangeAspect="1"/>
@@ -159,7 +89,7 @@
                   <pic:spPr>
                     <a:xfrm>
                       <a:off x="0" y="0"/>
-                      <a:ext cx="5940000" cy="4083750"/>
+                      <a:ext cx="5940000" cy="2568649"/>
                     </a:xfrm>
                     <a:prstGeom prst="rect"/>
                   </pic:spPr>
@@ -175,539 +105,7 @@
         <w:pStyle w:val="Heading1"/>
       </w:pPr>
       <w:r>
-        <w:t>4. Cas d'utilisation (liste)</w:t>
-      </w:r>
-    </w:p>
-    <w:tbl>
-      <w:tblPr>
-        <w:tblStyle w:val="TableGrid"/>
-        <w:tblW w:type="auto" w:w="0"/>
-        <w:tblLook w:firstColumn="1" w:firstRow="1" w:lastColumn="0" w:lastRow="0" w:noHBand="0" w:noVBand="1" w:val="04A0"/>
-      </w:tblPr>
-      <w:tblGrid>
-        <w:gridCol w:w="2880"/>
-        <w:gridCol w:w="2880"/>
-        <w:gridCol w:w="2880"/>
-      </w:tblGrid>
-      <w:tr>
-        <w:tc>
-          <w:tcPr>
-            <w:tcW w:type="dxa" w:w="2880"/>
-          </w:tcPr>
-          <w:p>
-            <w:r>
-              <w:t>ID</w:t>
-            </w:r>
-          </w:p>
-        </w:tc>
-        <w:tc>
-          <w:tcPr>
-            <w:tcW w:type="dxa" w:w="2880"/>
-          </w:tcPr>
-          <w:p>
-            <w:r>
-              <w:t>Cas d'utilisation</w:t>
-            </w:r>
-          </w:p>
-        </w:tc>
-        <w:tc>
-          <w:tcPr>
-            <w:tcW w:type="dxa" w:w="2880"/>
-          </w:tcPr>
-          <w:p>
-            <w:r>
-              <w:t>Acteurs</w:t>
-            </w:r>
-          </w:p>
-        </w:tc>
-      </w:tr>
-      <w:tr>
-        <w:tc>
-          <w:tcPr>
-            <w:tcW w:type="dxa" w:w="2880"/>
-          </w:tcPr>
-          <w:p>
-            <w:r>
-              <w:t>UC01</w:t>
-            </w:r>
-          </w:p>
-        </w:tc>
-        <w:tc>
-          <w:tcPr>
-            <w:tcW w:type="dxa" w:w="2880"/>
-          </w:tcPr>
-          <w:p>
-            <w:r>
-              <w:t>S'authentifier</w:t>
-            </w:r>
-          </w:p>
-        </w:tc>
-        <w:tc>
-          <w:tcPr>
-            <w:tcW w:type="dxa" w:w="2880"/>
-          </w:tcPr>
-          <w:p>
-            <w:r>
-              <w:t>Tous les acteurs principaux</w:t>
-            </w:r>
-          </w:p>
-        </w:tc>
-      </w:tr>
-      <w:tr>
-        <w:tc>
-          <w:tcPr>
-            <w:tcW w:type="dxa" w:w="2880"/>
-          </w:tcPr>
-          <w:p>
-            <w:r>
-              <w:t>UC02</w:t>
-            </w:r>
-          </w:p>
-        </w:tc>
-        <w:tc>
-          <w:tcPr>
-            <w:tcW w:type="dxa" w:w="2880"/>
-          </w:tcPr>
-          <w:p>
-            <w:r>
-              <w:t>Gérer profil / CV</w:t>
-            </w:r>
-          </w:p>
-        </w:tc>
-        <w:tc>
-          <w:tcPr>
-            <w:tcW w:type="dxa" w:w="2880"/>
-          </w:tcPr>
-          <w:p>
-            <w:r>
-              <w:t>Candidat</w:t>
-            </w:r>
-          </w:p>
-        </w:tc>
-      </w:tr>
-      <w:tr>
-        <w:tc>
-          <w:tcPr>
-            <w:tcW w:type="dxa" w:w="2880"/>
-          </w:tcPr>
-          <w:p>
-            <w:r>
-              <w:t>UC03</w:t>
-            </w:r>
-          </w:p>
-        </w:tc>
-        <w:tc>
-          <w:tcPr>
-            <w:tcW w:type="dxa" w:w="2880"/>
-          </w:tcPr>
-          <w:p>
-            <w:r>
-              <w:t>Consulter offres publiques</w:t>
-            </w:r>
-          </w:p>
-        </w:tc>
-        <w:tc>
-          <w:tcPr>
-            <w:tcW w:type="dxa" w:w="2880"/>
-          </w:tcPr>
-          <w:p>
-            <w:r>
-              <w:t>Candidat</w:t>
-            </w:r>
-          </w:p>
-        </w:tc>
-      </w:tr>
-      <w:tr>
-        <w:tc>
-          <w:tcPr>
-            <w:tcW w:type="dxa" w:w="2880"/>
-          </w:tcPr>
-          <w:p>
-            <w:r>
-              <w:t>UC04</w:t>
-            </w:r>
-          </w:p>
-        </w:tc>
-        <w:tc>
-          <w:tcPr>
-            <w:tcW w:type="dxa" w:w="2880"/>
-          </w:tcPr>
-          <w:p>
-            <w:r>
-              <w:t>Postuler (&lt;&lt;include&gt;&gt; matching)</w:t>
-            </w:r>
-          </w:p>
-        </w:tc>
-        <w:tc>
-          <w:tcPr>
-            <w:tcW w:type="dxa" w:w="2880"/>
-          </w:tcPr>
-          <w:p>
-            <w:r>
-              <w:t>Candidat, Matching local</w:t>
-            </w:r>
-          </w:p>
-        </w:tc>
-      </w:tr>
-      <w:tr>
-        <w:tc>
-          <w:tcPr>
-            <w:tcW w:type="dxa" w:w="2880"/>
-          </w:tcPr>
-          <w:p>
-            <w:r>
-              <w:t>UC05</w:t>
-            </w:r>
-          </w:p>
-        </w:tc>
-        <w:tc>
-          <w:tcPr>
-            <w:tcW w:type="dxa" w:w="2880"/>
-          </w:tcPr>
-          <w:p>
-            <w:r>
-              <w:t>Suivre candidatures + SLA</w:t>
-            </w:r>
-          </w:p>
-        </w:tc>
-        <w:tc>
-          <w:tcPr>
-            <w:tcW w:type="dxa" w:w="2880"/>
-          </w:tcPr>
-          <w:p>
-            <w:r>
-              <w:t>Candidat, Scheduler</w:t>
-            </w:r>
-          </w:p>
-        </w:tc>
-      </w:tr>
-      <w:tr>
-        <w:tc>
-          <w:tcPr>
-            <w:tcW w:type="dxa" w:w="2880"/>
-          </w:tcPr>
-          <w:p>
-            <w:r>
-              <w:t>UC06</w:t>
-            </w:r>
-          </w:p>
-        </w:tc>
-        <w:tc>
-          <w:tcPr>
-            <w:tcW w:type="dxa" w:w="2880"/>
-          </w:tcPr>
-          <w:p>
-            <w:r>
-              <w:t>Retirer candidature</w:t>
-            </w:r>
-          </w:p>
-        </w:tc>
-        <w:tc>
-          <w:tcPr>
-            <w:tcW w:type="dxa" w:w="2880"/>
-          </w:tcPr>
-          <w:p>
-            <w:r>
-              <w:t>Candidat</w:t>
-            </w:r>
-          </w:p>
-        </w:tc>
-      </w:tr>
-      <w:tr>
-        <w:tc>
-          <w:tcPr>
-            <w:tcW w:type="dxa" w:w="2880"/>
-          </w:tcPr>
-          <w:p>
-            <w:r>
-              <w:t>UC07</w:t>
-            </w:r>
-          </w:p>
-        </w:tc>
-        <w:tc>
-          <w:tcPr>
-            <w:tcW w:type="dxa" w:w="2880"/>
-          </w:tcPr>
-          <w:p>
-            <w:r>
-              <w:t>Créer / publier offre + SLA</w:t>
-            </w:r>
-          </w:p>
-        </w:tc>
-        <w:tc>
-          <w:tcPr>
-            <w:tcW w:type="dxa" w:w="2880"/>
-          </w:tcPr>
-          <w:p>
-            <w:r>
-              <w:t>Personne RH</w:t>
-            </w:r>
-          </w:p>
-        </w:tc>
-      </w:tr>
-      <w:tr>
-        <w:tc>
-          <w:tcPr>
-            <w:tcW w:type="dxa" w:w="2880"/>
-          </w:tcPr>
-          <w:p>
-            <w:r>
-              <w:t>UC08</w:t>
-            </w:r>
-          </w:p>
-        </w:tc>
-        <w:tc>
-          <w:tcPr>
-            <w:tcW w:type="dxa" w:w="2880"/>
-          </w:tcPr>
-          <w:p>
-            <w:r>
-              <w:t>Piloter pipeline / refuser (catalogue)</w:t>
-            </w:r>
-          </w:p>
-        </w:tc>
-        <w:tc>
-          <w:tcPr>
-            <w:tcW w:type="dxa" w:w="2880"/>
-          </w:tcPr>
-          <w:p>
-            <w:r>
-              <w:t>Personne RH</w:t>
-            </w:r>
-          </w:p>
-        </w:tc>
-      </w:tr>
-      <w:tr>
-        <w:tc>
-          <w:tcPr>
-            <w:tcW w:type="dxa" w:w="2880"/>
-          </w:tcPr>
-          <w:p>
-            <w:r>
-              <w:t>UC09</w:t>
-            </w:r>
-          </w:p>
-        </w:tc>
-        <w:tc>
-          <w:tcPr>
-            <w:tcW w:type="dxa" w:w="2880"/>
-          </w:tcPr>
-          <w:p>
-            <w:r>
-              <w:t>Planifier entretien</w:t>
-            </w:r>
-          </w:p>
-        </w:tc>
-        <w:tc>
-          <w:tcPr>
-            <w:tcW w:type="dxa" w:w="2880"/>
-          </w:tcPr>
-          <w:p>
-            <w:r>
-              <w:t>Personne RH, Hiring Manager</w:t>
-            </w:r>
-          </w:p>
-        </w:tc>
-      </w:tr>
-      <w:tr>
-        <w:tc>
-          <w:tcPr>
-            <w:tcW w:type="dxa" w:w="2880"/>
-          </w:tcPr>
-          <w:p>
-            <w:r>
-              <w:t>UC10</w:t>
-            </w:r>
-          </w:p>
-        </w:tc>
-        <w:tc>
-          <w:tcPr>
-            <w:tcW w:type="dxa" w:w="2880"/>
-          </w:tcPr>
-          <w:p>
-            <w:r>
-              <w:t>Noter scorecard</w:t>
-            </w:r>
-          </w:p>
-        </w:tc>
-        <w:tc>
-          <w:tcPr>
-            <w:tcW w:type="dxa" w:w="2880"/>
-          </w:tcPr>
-          <w:p>
-            <w:r>
-              <w:t>Hiring Manager, Personne RH</w:t>
-            </w:r>
-          </w:p>
-        </w:tc>
-      </w:tr>
-      <w:tr>
-        <w:tc>
-          <w:tcPr>
-            <w:tcW w:type="dxa" w:w="2880"/>
-          </w:tcPr>
-          <w:p>
-            <w:r>
-              <w:t>UC11</w:t>
-            </w:r>
-          </w:p>
-        </w:tc>
-        <w:tc>
-          <w:tcPr>
-            <w:tcW w:type="dxa" w:w="2880"/>
-          </w:tcPr>
-          <w:p>
-            <w:r>
-              <w:t>Inviter membres organisation</w:t>
-            </w:r>
-          </w:p>
-        </w:tc>
-        <w:tc>
-          <w:tcPr>
-            <w:tcW w:type="dxa" w:w="2880"/>
-          </w:tcPr>
-          <w:p>
-            <w:r>
-              <w:t>Owner</w:t>
-            </w:r>
-          </w:p>
-        </w:tc>
-      </w:tr>
-      <w:tr>
-        <w:tc>
-          <w:tcPr>
-            <w:tcW w:type="dxa" w:w="2880"/>
-          </w:tcPr>
-          <w:p>
-            <w:r>
-              <w:t>UC12</w:t>
-            </w:r>
-          </w:p>
-        </w:tc>
-        <w:tc>
-          <w:tcPr>
-            <w:tcW w:type="dxa" w:w="2880"/>
-          </w:tcPr>
-          <w:p>
-            <w:r>
-              <w:t>Assistance IA (crédits)</w:t>
-            </w:r>
-          </w:p>
-        </w:tc>
-        <w:tc>
-          <w:tcPr>
-            <w:tcW w:type="dxa" w:w="2880"/>
-          </w:tcPr>
-          <w:p>
-            <w:r>
-              <w:t>Candidat, Personne RH, LLM</w:t>
-            </w:r>
-          </w:p>
-        </w:tc>
-      </w:tr>
-      <w:tr>
-        <w:tc>
-          <w:tcPr>
-            <w:tcW w:type="dxa" w:w="2880"/>
-          </w:tcPr>
-          <w:p>
-            <w:r>
-              <w:t>UC13</w:t>
-            </w:r>
-          </w:p>
-        </w:tc>
-        <w:tc>
-          <w:tcPr>
-            <w:tcW w:type="dxa" w:w="2880"/>
-          </w:tcPr>
-          <w:p>
-            <w:r>
-              <w:t>Vérifier entreprise (ICE)</w:t>
-            </w:r>
-          </w:p>
-        </w:tc>
-        <w:tc>
-          <w:tcPr>
-            <w:tcW w:type="dxa" w:w="2880"/>
-          </w:tcPr>
-          <w:p>
-            <w:r>
-              <w:t>Administrateur</w:t>
-            </w:r>
-          </w:p>
-        </w:tc>
-      </w:tr>
-      <w:tr>
-        <w:tc>
-          <w:tcPr>
-            <w:tcW w:type="dxa" w:w="2880"/>
-          </w:tcPr>
-          <w:p>
-            <w:r>
-              <w:t>UC14</w:t>
-            </w:r>
-          </w:p>
-        </w:tc>
-        <w:tc>
-          <w:tcPr>
-            <w:tcW w:type="dxa" w:w="2880"/>
-          </w:tcPr>
-          <w:p>
-            <w:r>
-              <w:t>Exporter données personnelles</w:t>
-            </w:r>
-          </w:p>
-        </w:tc>
-        <w:tc>
-          <w:tcPr>
-            <w:tcW w:type="dxa" w:w="2880"/>
-          </w:tcPr>
-          <w:p>
-            <w:r>
-              <w:t>Candidat</w:t>
-            </w:r>
-          </w:p>
-        </w:tc>
-      </w:tr>
-      <w:tr>
-        <w:tc>
-          <w:tcPr>
-            <w:tcW w:type="dxa" w:w="2880"/>
-          </w:tcPr>
-          <w:p>
-            <w:r>
-              <w:t>UC15</w:t>
-            </w:r>
-          </w:p>
-        </w:tc>
-        <w:tc>
-          <w:tcPr>
-            <w:tcW w:type="dxa" w:w="2880"/>
-          </w:tcPr>
-          <w:p>
-            <w:r>
-              <w:t>Administrer la plateforme</w:t>
-            </w:r>
-          </w:p>
-        </w:tc>
-        <w:tc>
-          <w:tcPr>
-            <w:tcW w:type="dxa" w:w="2880"/>
-          </w:tcPr>
-          <w:p>
-            <w:r>
-              <w:t>Administrateur</w:t>
-            </w:r>
-          </w:p>
-        </w:tc>
-      </w:tr>
-    </w:tbl>
-    <w:p>
-      <w:pPr>
-        <w:pStyle w:val="Heading1"/>
-      </w:pPr>
-      <w:r>
-        <w:t>5. Règles UML respectées</w:t>
+        <w:t>3. Cas (bref)</w:t>
       </w:r>
     </w:p>
     <w:p>
@@ -715,7 +113,7 @@
         <w:pStyle w:val="ListBullet"/>
       </w:pPr>
       <w:r>
-        <w:t>Un seul système borné (HireLink) — les acteurs restent hors frontière.</w:t>
+        <w:t>Candidat : S'authentifier, Auth. Google, Profil, Offres, Postuler, Suivre</w:t>
       </w:r>
     </w:p>
     <w:p>
@@ -723,7 +121,7 @@
         <w:pStyle w:val="ListBullet"/>
       </w:pPr>
       <w:r>
-        <w:t>Acteurs principaux à gauche, secondaires à droite (lisibilité pédagogique).</w:t>
+        <w:t>RH : Créer offre, Pipeline, IA, Payer</w:t>
       </w:r>
     </w:p>
     <w:p>
@@ -731,7 +129,7 @@
         <w:pStyle w:val="ListBullet"/>
       </w:pPr>
       <w:r>
-        <w:t>Noms de cas d'utilisation = verbe à l'infinitif + complément.</w:t>
+        <w:t>HM : Noter · Admin : Administrer</w:t>
       </w:r>
     </w:p>
     <w:p>
@@ -739,7 +137,15 @@
         <w:pStyle w:val="ListBullet"/>
       </w:pPr>
       <w:r>
-        <w:t>Pas de flux détaillés ici (réservés aux diagrammes de séquence).</w:t>
+        <w:t>Support : Matching, Notifier</w:t>
+      </w:r>
+    </w:p>
+    <w:p>
+      <w:pPr>
+        <w:pStyle w:val="Heading1"/>
+      </w:pPr>
+      <w:r>
+        <w:t>4. Relations</w:t>
       </w:r>
     </w:p>
     <w:p>
@@ -747,7 +153,31 @@
         <w:pStyle w:val="ListBullet"/>
       </w:pPr>
       <w:r>
-        <w:t>&lt;&lt;include&gt;&gt; : le matching local est toujours exécuté lors d'une candidature.</w:t>
+        <w:t>&lt;&lt;include&gt;&gt; Postuler → Calculer matching</w:t>
+      </w:r>
+    </w:p>
+    <w:p>
+      <w:pPr>
+        <w:pStyle w:val="ListBullet"/>
+      </w:pPr>
+      <w:r>
+        <w:t>&lt;&lt;include&gt;&gt; Gérer le pipeline → Notifier</w:t>
+      </w:r>
+    </w:p>
+    <w:p>
+      <w:pPr>
+        <w:pStyle w:val="ListBullet"/>
+      </w:pPr>
+      <w:r>
+        <w:t>&lt;&lt;extend&gt;&gt; Auth. Google → S'authentifier</w:t>
+      </w:r>
+    </w:p>
+    <w:p>
+      <w:pPr>
+        <w:pStyle w:val="ListBullet"/>
+      </w:pPr>
+      <w:r>
+        <w:t>&lt;&lt;extend&gt;&gt; Payer / s'abonner → Utiliser l'IA</w:t>
       </w:r>
     </w:p>
     <w:sectPr>

</xml_diff>